<commit_message>
v2.6.0: bilingual UI, purchase request totals, translation updates
- Full bilingual system (AR/EN): all views updated with iw_t() for PHP
  and iwT()/iwAdmin.strings for JS; language auto-detected from WordPress
  locale — manual toggle button removed from Settings
- Purchase request approval: estimated total amount displayed prominently
  with live recalculation when approver edits quantities or prices
- Translation files (.pot/.po/.mo) updated to v2.6.0; fixed استيراد →
  استيراد من Excel msgid mismatch
- DOCUMENTATION.md updated with v2.6.0 changelog and new feature docs
- Laravel PRD .docx regenerated (v2.6.0) with bilingual and total amount
  requirements added

https://claude.ai/code/session_017MLk97T4WmbBBrp3ezoxZJ
</commit_message>
<xml_diff>
--- a/Institute-Warehouse-Laravel-PRD.docx
+++ b/Institute-Warehouse-Laravel-PRD.docx
@@ -65,7 +65,7 @@
               <w:rPr>
                 <w:sz w:val="22"/>
               </w:rPr>
-              <w:t>1.0.0</w:t>
+              <w:t>2.6.0</w:t>
             </w:r>
           </w:p>
         </w:tc>
@@ -724,7 +724,7 @@
         <w:rPr>
           <w:sz w:val="22"/>
         </w:rPr>
-        <w:t>Bilingual interface: Arabic (RTL) and English</w:t>
+        <w:t>Bilingual interface: Arabic (RTL) and English — auto-detected from WordPress locale</w:t>
       </w:r>
     </w:p>
     <w:p>
@@ -758,6 +758,17 @@
           <w:sz w:val="22"/>
         </w:rPr>
         <w:t>Auto-generated purchase requests when stock hits minimum level</w:t>
+      </w:r>
+    </w:p>
+    <w:p>
+      <w:pPr>
+        <w:pStyle w:val="ListBullet"/>
+      </w:pPr>
+      <w:r>
+        <w:rPr>
+          <w:sz w:val="22"/>
+        </w:rPr>
+        <w:t>Estimated total amount displayed on purchase request approval screen with live recalculation</w:t>
       </w:r>
     </w:p>
     <w:p>
@@ -6864,6 +6875,88 @@
               <w:rPr>
                 <w:sz w:val="20"/>
               </w:rPr>
+              <w:t>Display estimated total amount per request on approval screen</w:t>
+            </w:r>
+          </w:p>
+        </w:tc>
+        <w:tc>
+          <w:tcPr>
+            <w:tcW w:type="dxa" w:w="3135"/>
+          </w:tcPr>
+          <w:p>
+            <w:r>
+              <w:rPr>
+                <w:sz w:val="20"/>
+              </w:rPr>
+              <w:t>Must Have</w:t>
+            </w:r>
+          </w:p>
+        </w:tc>
+      </w:tr>
+      <w:tr>
+        <w:tc>
+          <w:tcPr>
+            <w:tcW w:type="dxa" w:w="3135"/>
+          </w:tcPr>
+          <w:p>
+            <w:r>
+              <w:rPr>
+                <w:sz w:val="20"/>
+              </w:rPr>
+              <w:t>PRD-PR-006</w:t>
+            </w:r>
+          </w:p>
+        </w:tc>
+        <w:tc>
+          <w:tcPr>
+            <w:tcW w:type="dxa" w:w="3135"/>
+          </w:tcPr>
+          <w:p>
+            <w:r>
+              <w:rPr>
+                <w:sz w:val="20"/>
+              </w:rPr>
+              <w:t>Live recalculate total when approver edits quantities/prices</w:t>
+            </w:r>
+          </w:p>
+        </w:tc>
+        <w:tc>
+          <w:tcPr>
+            <w:tcW w:type="dxa" w:w="3135"/>
+          </w:tcPr>
+          <w:p>
+            <w:r>
+              <w:rPr>
+                <w:sz w:val="20"/>
+              </w:rPr>
+              <w:t>Must Have</w:t>
+            </w:r>
+          </w:p>
+        </w:tc>
+      </w:tr>
+      <w:tr>
+        <w:tc>
+          <w:tcPr>
+            <w:tcW w:type="dxa" w:w="3135"/>
+          </w:tcPr>
+          <w:p>
+            <w:r>
+              <w:rPr>
+                <w:sz w:val="20"/>
+              </w:rPr>
+              <w:t>PRD-PR-007</w:t>
+            </w:r>
+          </w:p>
+        </w:tc>
+        <w:tc>
+          <w:tcPr>
+            <w:tcW w:type="dxa" w:w="3135"/>
+          </w:tcPr>
+          <w:p>
+            <w:r>
+              <w:rPr>
+                <w:sz w:val="20"/>
+              </w:rPr>
               <w:t>Approve request with electronic signature</w:t>
             </w:r>
           </w:p>
@@ -6892,7 +6985,7 @@
               <w:rPr>
                 <w:sz w:val="20"/>
               </w:rPr>
-              <w:t>PRD-PR-006</w:t>
+              <w:t>PRD-PR-008</w:t>
             </w:r>
           </w:p>
         </w:tc>
@@ -6933,7 +7026,7 @@
               <w:rPr>
                 <w:sz w:val="20"/>
               </w:rPr>
-              <w:t>PRD-PR-007</w:t>
+              <w:t>PRD-PR-009</w:t>
             </w:r>
           </w:p>
         </w:tc>
@@ -6974,7 +7067,7 @@
               <w:rPr>
                 <w:sz w:val="20"/>
               </w:rPr>
-              <w:t>PRD-PR-008</w:t>
+              <w:t>PRD-PR-010</w:t>
             </w:r>
           </w:p>
         </w:tc>
@@ -18865,7 +18958,7 @@
               <w:rPr>
                 <w:sz w:val="20"/>
               </w:rPr>
-              <w:t>Full Arabic (RTL) and English support; switchable via user preference</w:t>
+              <w:t>Full Arabic (RTL) and English support; language auto-detected from WordPress/app locale — no manual toggle button</w:t>
             </w:r>
           </w:p>
         </w:tc>

</xml_diff>